<commit_message>
Fix Armor lockout, Boss Tier note, Scout typing; add Ability Activation term and optional Tiered Mission Draw
Adds a damage floor to Armor so stacked boss Armor can never fully zero out
low-rank attackers, corrects the Boss Tier design note's inaccurate T2/T4
claim against the real Boss Stats.csv data, renames the ambiguous "Scout"
unit Type to "Infantry Scout", defines Ability Activation as a trackable
event for cards that depend on it, and adds Tiered Mission Draw as an
optional rule after the default blind Mission draw was shown to have a
~32% chance of dealing 2-player games zero completable Round 1 missions.

Co-Authored-By: Claude Sonnet 4.6 <noreply@anthropic.com>
</commit_message>
<xml_diff>
--- a/Board_Rules_Reorganized.docx
+++ b/Board_Rules_Reorganized.docx
@@ -1479,6 +1479,29 @@
       </w:pPr>
       <w:r>
         <w:t xml:space="preserve">Worker Placement</w:t>
+      </w:r>
+    </w:p>
+    <w:p>
+      <w:pPr>
+        <w:spacing w:after="120"/>
+      </w:pPr>
+      <w:r>
+        <w:rPr>
+          <w:rFonts w:ascii="Arial" w:cs="Arial" w:eastAsia="Arial" w:hAnsi="Arial"/>
+          <w:b/>
+          <w:bCs/>
+          <w:sz w:val="22"/>
+          <w:szCs w:val="22"/>
+        </w:rPr>
+        <w:t xml:space="preserve">Optional – Tiered Mission Draw: </w:t>
+      </w:r>
+      <w:r>
+        <w:rPr>
+          <w:rFonts w:ascii="Arial" w:cs="Arial" w:eastAsia="Arial" w:hAnsi="Arial"/>
+          <w:sz w:val="22"/>
+          <w:szCs w:val="22"/>
+        </w:rPr>
+        <w:t xml:space="preserve">instead of drawing the Mission Assignment pool blind from one shuffled deck, separate the Mission deck into piles by Rank (see 2.1 Prepare the decks). Filling each pool slot: Rank 1-3 (Conscript/Private/Sergeant) missions are the commander’s free choice, no roll. Any Rank 4+ mission needs a 1d8 roll: at or below (highest current player Rank + 1), use that rolled Rank; above it, scale down to (highest player Rank + 1) instead. Use this if your group wants Mission Assignment to reliably hand out completable missions instead of occasionally drafting a table full of dead cards early on (a 2-player Round 1 draw has roughly a 1-in-3 chance under the default blind draw of pulling zero completable missions for either starting player); the default blind draw is simpler to set up and keeps every mission a surprise.</w:t>
       </w:r>
     </w:p>
     <w:p>
@@ -2349,7 +2372,7 @@
           <w:sz w:val="20"/>
           <w:szCs w:val="20"/>
         </w:rPr>
-        <w:t xml:space="preserve">Design note: the original card data never states what triggers a tier to advance. This pacing is an inference (every boss tier alternates a flat stat boost with a unique mechanic across exactly 5 tiers, consistent with steady escalation over a full game) — treat it as the working rule unless playtesting suggests otherwise.</w:t>
+        <w:t xml:space="preserve">Design note: the original card data never states what triggers a tier to advance. This pacing is an inference (T2 is +5 Attack for 14 of 15 bosses plus a secondary boost that varies by boss — Health, Shields, Armor, or a thematic non-stat effect, with Dread Echo as the lone exception at +10 Attack and no secondary boost; T4 pairs a defensive stat boost (Health, Shields, or Armor) with “Heals 5 health on kill” on every boss; T3/T5 carry each boss’s unique mechanic — consistent with steady escalation over a full game) — treat it as the working rule unless playtesting suggests otherwise.</w:t>
       </w:r>
     </w:p>
     <w:tbl>
@@ -4097,7 +4120,7 @@
           <w:sz w:val="22"/>
           <w:szCs w:val="22"/>
         </w:rPr>
-        <w:t xml:space="preserve">Type — Infantry, Mech, or Vehicle. Some units of each type are additionally marked Scout (e.g. “Mech Scout”, “Vehicle Scout”) — Scout is a modifier on top of the base type, not a separate category, and marks a unit as eligible to be donated to Command for use as a scout (see 3.2 Assign Scouts and 3.1 Command Donations).</w:t>
+        <w:t xml:space="preserve">Type — Infantry, Mech, or Vehicle. Some units of each type are additionally marked Scout (e.g. “Infantry Scout”, “Mech Scout”, “Vehicle Scout”) — Scout is a modifier on top of the base type, not a separate category, and marks a unit as eligible to be donated to Command for use as a scout (see 3.2 Assign Scouts and 3.1 Command Donations).</w:t>
       </w:r>
     </w:p>
     <w:p>
@@ -6073,15 +6096,15 @@
           <w:sz w:val="22"/>
           <w:szCs w:val="22"/>
         </w:rPr>
-        <w:t xml:space="preserve">Active: </w:t>
-      </w:r>
-      <w:r>
-        <w:rPr>
-          <w:rFonts w:ascii="Arial" w:cs="Arial" w:eastAsia="Arial" w:hAnsi="Arial"/>
-          <w:sz w:val="22"/>
-          <w:szCs w:val="22"/>
-        </w:rPr>
-        <w:t xml:space="preserve">the slot in a lane currently fighting — a player's Active unit or an enemy's Active card takes part in combat each round. Compare Reserve.</w:t>
+        <w:t xml:space="preserve">Ability Activation: </w:t>
+      </w:r>
+      <w:r>
+        <w:rPr>
+          <w:rFonts w:ascii="Arial" w:cs="Arial" w:eastAsia="Arial" w:hAnsi="Arial"/>
+          <w:sz w:val="22"/>
+          <w:szCs w:val="22"/>
+        </w:rPr>
+        <w:t xml:space="preserve">triggering a Primary/Secondary Ability, Active effect, or Instant effect on a Unit, Gear, Command Card, or Tactician, whether by player choice or because its stated trigger condition fires automatically (e.g. an on-hit, on-kill, or on-death effect). Passive effects never count, since they are continuously in effect rather than used. Enemies have no separate Active field: an enemy activates an ability when its Reveal effect triggers, or when a triggered clause inside its Passive text resolves — a flat, always-on bonus within that same Passive text does not count. Preventing an ability (a Denial effect stopping one of the above from resolving) is a separate, distinct event. See 3.5 Anytime Actions.</w:t>
       </w:r>
     </w:p>
     <w:p>
@@ -6101,15 +6124,15 @@
           <w:sz w:val="22"/>
           <w:szCs w:val="22"/>
         </w:rPr>
-        <w:t xml:space="preserve">Commander: </w:t>
-      </w:r>
-      <w:r>
-        <w:rPr>
-          <w:rFonts w:ascii="Arial" w:cs="Arial" w:eastAsia="Arial" w:hAnsi="Arial"/>
-          <w:sz w:val="22"/>
-          <w:szCs w:val="22"/>
-        </w:rPr>
-        <w:t xml:space="preserve">the player currently filling the Command role (the 1st worker placed at Command each round takes it). Runs Commander Actions, picks shop fills, resolves ties, and more — see 4.5 Command.</w:t>
+        <w:t xml:space="preserve">Active: </w:t>
+      </w:r>
+      <w:r>
+        <w:rPr>
+          <w:rFonts w:ascii="Arial" w:cs="Arial" w:eastAsia="Arial" w:hAnsi="Arial"/>
+          <w:sz w:val="22"/>
+          <w:szCs w:val="22"/>
+        </w:rPr>
+        <w:t xml:space="preserve">the slot in a lane currently fighting — a player's Active unit or an enemy's Active card takes part in combat each round. Compare Reserve.</w:t>
       </w:r>
     </w:p>
     <w:p>
@@ -6129,15 +6152,15 @@
           <w:sz w:val="22"/>
           <w:szCs w:val="22"/>
         </w:rPr>
-        <w:t xml:space="preserve">Lane: </w:t>
-      </w:r>
-      <w:r>
-        <w:rPr>
-          <w:rFonts w:ascii="Arial" w:cs="Arial" w:eastAsia="Arial" w:hAnsi="Arial"/>
-          <w:sz w:val="22"/>
-          <w:szCs w:val="22"/>
-        </w:rPr>
-        <w:t xml:space="preserve">one of the 4 parallel combat columns, each normally overseen by one player. Each lane has its own Active/Reserve slots for both players and enemies.</w:t>
+        <w:t xml:space="preserve">Commander: </w:t>
+      </w:r>
+      <w:r>
+        <w:rPr>
+          <w:rFonts w:ascii="Arial" w:cs="Arial" w:eastAsia="Arial" w:hAnsi="Arial"/>
+          <w:sz w:val="22"/>
+          <w:szCs w:val="22"/>
+        </w:rPr>
+        <w:t xml:space="preserve">the player currently filling the Command role (the 1st worker placed at Command each round takes it). Runs Commander Actions, picks shop fills, resolves ties, and more — see 4.5 Command.</w:t>
       </w:r>
     </w:p>
     <w:p>
@@ -6157,15 +6180,15 @@
           <w:sz w:val="22"/>
           <w:szCs w:val="22"/>
         </w:rPr>
-        <w:t xml:space="preserve">Overrun: </w:t>
-      </w:r>
-      <w:r>
-        <w:rPr>
-          <w:rFonts w:ascii="Arial" w:cs="Arial" w:eastAsia="Arial" w:hAnsi="Arial"/>
-          <w:sz w:val="22"/>
-          <w:szCs w:val="22"/>
-        </w:rPr>
-        <w:t xml:space="preserve">what happens to a lane when enemies survive combat there with no player unit left to defend it. Costs the player Progress Track 1 progress (see 3.4 Overrunning Lanes).</w:t>
+        <w:t xml:space="preserve">Lane: </w:t>
+      </w:r>
+      <w:r>
+        <w:rPr>
+          <w:rFonts w:ascii="Arial" w:cs="Arial" w:eastAsia="Arial" w:hAnsi="Arial"/>
+          <w:sz w:val="22"/>
+          <w:szCs w:val="22"/>
+        </w:rPr>
+        <w:t xml:space="preserve">one of the 4 parallel combat columns, each normally overseen by one player. Each lane has its own Active/Reserve slots for both players and enemies.</w:t>
       </w:r>
     </w:p>
     <w:p>
@@ -6185,15 +6208,15 @@
           <w:sz w:val="22"/>
           <w:szCs w:val="22"/>
         </w:rPr>
-        <w:t xml:space="preserve">Progress Track: </w:t>
-      </w:r>
-      <w:r>
-        <w:rPr>
-          <w:rFonts w:ascii="Arial" w:cs="Arial" w:eastAsia="Arial" w:hAnsi="Arial"/>
-          <w:sz w:val="22"/>
-          <w:szCs w:val="22"/>
-        </w:rPr>
-        <w:t xml:space="preserve">there are two — the player track and the enemy track, each running 0–10. The game ends the moment either fills (see Section 6, and 3.4 Escalate).</w:t>
+        <w:t xml:space="preserve">Overrun: </w:t>
+      </w:r>
+      <w:r>
+        <w:rPr>
+          <w:rFonts w:ascii="Arial" w:cs="Arial" w:eastAsia="Arial" w:hAnsi="Arial"/>
+          <w:sz w:val="22"/>
+          <w:szCs w:val="22"/>
+        </w:rPr>
+        <w:t xml:space="preserve">what happens to a lane when enemies survive combat there with no player unit left to defend it. Costs the player Progress Track 1 progress (see 3.4 Overrunning Lanes).</w:t>
       </w:r>
     </w:p>
     <w:p>
@@ -6213,15 +6236,15 @@
           <w:sz w:val="22"/>
           <w:szCs w:val="22"/>
         </w:rPr>
-        <w:t xml:space="preserve">Rank: </w:t>
-      </w:r>
-      <w:r>
-        <w:rPr>
-          <w:rFonts w:ascii="Arial" w:cs="Arial" w:eastAsia="Arial" w:hAnsi="Arial"/>
-          <w:sz w:val="22"/>
-          <w:szCs w:val="22"/>
-        </w:rPr>
-        <w:t xml:space="preserve">a player's progression level, lowest to highest: Conscript, Private, Sergeant, Captain, Major, Colonel, Specialist, Brigadier. Gates which Units/Gear can be deployed, and several other rules (shop fill, Promotions, worker-sharing priority) key off it directly.</w:t>
+        <w:t xml:space="preserve">Progress Track: </w:t>
+      </w:r>
+      <w:r>
+        <w:rPr>
+          <w:rFonts w:ascii="Arial" w:cs="Arial" w:eastAsia="Arial" w:hAnsi="Arial"/>
+          <w:sz w:val="22"/>
+          <w:szCs w:val="22"/>
+        </w:rPr>
+        <w:t xml:space="preserve">there are two — the player track and the enemy track, each running 0–10. The game ends the moment either fills (see Section 6, and 3.4 Escalate).</w:t>
       </w:r>
     </w:p>
     <w:p>
@@ -6241,15 +6264,15 @@
           <w:sz w:val="22"/>
           <w:szCs w:val="22"/>
         </w:rPr>
-        <w:t xml:space="preserve">Reserve: </w:t>
-      </w:r>
-      <w:r>
-        <w:rPr>
-          <w:rFonts w:ascii="Arial" w:cs="Arial" w:eastAsia="Arial" w:hAnsi="Arial"/>
-          <w:sz w:val="22"/>
-          <w:szCs w:val="22"/>
-        </w:rPr>
-        <w:t xml:space="preserve">units or enemies in a lane waiting their turn — they don't fight until promoted into the Active slot, unless a specific card says otherwise. Compare Active.</w:t>
+        <w:t xml:space="preserve">Rank: </w:t>
+      </w:r>
+      <w:r>
+        <w:rPr>
+          <w:rFonts w:ascii="Arial" w:cs="Arial" w:eastAsia="Arial" w:hAnsi="Arial"/>
+          <w:sz w:val="22"/>
+          <w:szCs w:val="22"/>
+        </w:rPr>
+        <w:t xml:space="preserve">a player's progression level, lowest to highest: Conscript, Private, Sergeant, Captain, Major, Colonel, Specialist, Brigadier. Gates which Units/Gear can be deployed, and several other rules (shop fill, Promotions, worker-sharing priority) key off it directly.</w:t>
       </w:r>
     </w:p>
     <w:p>
@@ -6269,6 +6292,34 @@
           <w:sz w:val="22"/>
           <w:szCs w:val="22"/>
         </w:rPr>
+        <w:t xml:space="preserve">Reserve: </w:t>
+      </w:r>
+      <w:r>
+        <w:rPr>
+          <w:rFonts w:ascii="Arial" w:cs="Arial" w:eastAsia="Arial" w:hAnsi="Arial"/>
+          <w:sz w:val="22"/>
+          <w:szCs w:val="22"/>
+        </w:rPr>
+        <w:t xml:space="preserve">units or enemies in a lane waiting their turn — they don't fight until promoted into the Active slot, unless a specific card says otherwise. Compare Active.</w:t>
+      </w:r>
+    </w:p>
+    <w:p>
+      <w:pPr>
+        <w:pStyle w:val="ListParagraph"/>
+        <w:numPr>
+          <w:ilvl w:val="0"/>
+          <w:numId w:val="2"/>
+        </w:numPr>
+        <w:spacing w:after="80"/>
+      </w:pPr>
+      <w:r>
+        <w:rPr>
+          <w:rFonts w:ascii="Arial" w:cs="Arial" w:eastAsia="Arial" w:hAnsi="Arial"/>
+          <w:b/>
+          <w:bCs/>
+          <w:sz w:val="22"/>
+          <w:szCs w:val="22"/>
+        </w:rPr>
         <w:t xml:space="preserve">Tier (Boss): </w:t>
       </w:r>
       <w:r>
@@ -6330,7 +6381,7 @@
           <w:sz w:val="22"/>
           <w:szCs w:val="22"/>
         </w:rPr>
-        <w:t xml:space="preserve">Reduce damage per instance.</w:t>
+        <w:t xml:space="preserve">Reduce damage per instance (minimum 1 damage always gets through).</w:t>
       </w:r>
     </w:p>
     <w:p>

</xml_diff>

<commit_message>
Rebalance Vote of No Confidence outcomes for symmetry
A believed accusation was the only branch that ever confirmed the truth,
while a rejected vote cost the accuser their whole escrow for no
information either way, and a wrong-but-believed accusation only hit the
accuser's Rank with no effect on their own Secret Objective options.
Now a caught traitor keeps any non-traitor card they're also holding
instead of a full reset, a false accusation costs the accuser one of
their own two cards (chosen by the player they wrongly accused), and a
rejected vote fully refunds the accuser's escrow instead of confiscating
it for nothing.

Co-Authored-By: Claude Sonnet 4.6 <noreply@anthropic.com>
</commit_message>
<xml_diff>
--- a/Board_Rules_Reorganized.docx
+++ b/Board_Rules_Reorganized.docx
@@ -3096,7 +3096,7 @@
                 <w:sz w:val="22"/>
                 <w:szCs w:val="22"/>
               </w:rPr>
-              <w:t xml:space="preserve">both objectives are discarded and replaced with 2 new Allied-only objectives. The escrowed resources and Command Cards are returned to the accuser in full, and the accuser is promoted +1 Rank.</w:t>
+              <w:t xml:space="preserve">if one of the two revealed cards is Allied or Neutral, the accused keeps that card and discards the traitor-aligned one — caught and stripped of their sabotage angle, without losing a legitimate objective they were already pursuing. If both revealed cards are Saboteur or Chaos, discard both and deal 1 new Allied objective, revealed face-up to the table to confirm it’s genuinely Allied. Either way the accused now holds 1 Secret Objective card going forward. The escrowed resources and Command Cards are returned to the accuser in full, and the accuser is promoted +1 Rank.</w:t>
             </w:r>
           </w:p>
           <w:p>
@@ -3124,7 +3124,7 @@
                 <w:sz w:val="22"/>
                 <w:szCs w:val="22"/>
               </w:rPr>
-              <w:t xml:space="preserve">the accuser does not get their resources/cards back — all escrowed resources go to the Command supply, and all escrowed Command Cards are handed to the current commander, who distributes them among the rest of the team (anyone except the accuser). The accuser is demoted 2 Ranks, and the wrongly-accused player gets to look at the accuser’s own Secret Objective cards.</w:t>
+              <w:t xml:space="preserve">the accuser does not get their resources/cards back — all escrowed resources go to the Command supply, and all escrowed Command Cards are handed to the current commander, who distributes them among the rest of the team (anyone except the accuser). The accuser is demoted 2 Ranks. The wrongly-accused player looks at both of the accuser’s Secret Objective cards and picks one to discard face-up (shown to the table) — the accuser keeps the other, still-hidden card, leaving them with 1 Secret Objective card going forward.</w:t>
             </w:r>
           </w:p>
           <w:p>
@@ -3147,7 +3147,7 @@
                 <w:sz w:val="22"/>
                 <w:szCs w:val="22"/>
               </w:rPr>
-              <w:t xml:space="preserve">(majority/tiebreak disbelieves) nothing is revealed. The accuser does not get their resources/cards back (same disposal as a false accusation above). The accused gains +1 resource of their choice.</w:t>
+              <w:t xml:space="preserve">(majority/tiebreak disbelieves) nothing else happens. The escrowed resources and Command Cards are returned to the accuser in full. The accused picks one of the accuser’s two Secret Objective cards and it is revealed (not discarded) — the accuser keeps both cards.</w:t>
             </w:r>
           </w:p>
         </w:tc>
@@ -3184,7 +3184,7 @@
           <w:sz w:val="20"/>
           <w:szCs w:val="20"/>
         </w:rPr>
-        <w:t xml:space="preserve">Added because the base game had no way for the team to act on suspicion of a Saboteur at all — only a hidden card with zero interaction surface. The steep cost lands on the accuser specifically, not the team’s shared resources, so a bad-faith accusation hurts the accuser more than anyone. Not yet simulation-tested; treat the costs/rewards as a first draft to adjust after a few plays.</w:t>
+        <w:t xml:space="preserve">Added because the base game had no way for the team to act on suspicion of a Saboteur at all — only a hidden card with zero interaction surface. The steep cost lands on the accuser specifically, not the team’s shared resources, so a bad-faith accusation hurts the accuser more than anyone. Revised from the first draft so a successful true accusation and a wrongly-believed false one land symmetrically (both leave the exposed player at 1 Secret Objective card instead of one side getting a full reset), so a rejected accusation costs the accuser nothing but a peek at one card instead of their whole escrow, and so the opposing player — not the one being exposed — picks which card comes out. Not yet simulation-tested; treat the costs/rewards as a first draft to adjust after a few plays.</w:t>
       </w:r>
     </w:p>
     <w:p>

</xml_diff>

<commit_message>
Reconcile Location Actions.csv with Rules.docx and fill the Enemy Disposal gap
Location Actions.csv had drifted from the prose rules in three places that
change actual numbers: Containment Block's Alien formula, Battlefield's
resource bonus (per worker vs per commander Rank), and an unintended
trade-off on Command Donations. Corrected all three to match Rules.docx,
fixed four cosmetic naming mismatches, and used the CSV's existing "Enemy
Disposal" pile to answer a real gap in the rules text: where a dead enemy
goes when Containment has no free Holding Cell.

Co-Authored-By: Claude Sonnet 4.6 <noreply@anthropic.com>
</commit_message>
<xml_diff>
--- a/Board_Rules_Reorganized.docx
+++ b/Board_Rules_Reorganized.docx
@@ -2271,7 +2271,7 @@
           <w:sz w:val="20"/>
           <w:szCs w:val="20"/>
         </w:rPr>
-        <w:t xml:space="preserve">Dead enemies can be moved to Containment if space allows; existing contained units may be discarded to make room.</w:t>
+        <w:t xml:space="preserve">Dead enemies can be moved to Containment if space allows; existing contained units may be discarded to make room. If no space is freed up, the dead enemy goes to Enemy Disposal at Command instead.</w:t>
       </w:r>
     </w:p>
     <w:p>
@@ -3595,6 +3595,26 @@
           <w:szCs w:val="22"/>
         </w:rPr>
         <w:t xml:space="preserve">Graveyard: dead units go here.</w:t>
+      </w:r>
+    </w:p>
+    <w:p>
+      <w:pPr>
+        <w:pStyle w:val="ListParagraph"/>
+        <w:numPr>
+          <w:ilvl w:val="0"/>
+          <w:numId w:val="2"/>
+        </w:numPr>
+        <w:spacing w:after="80"/>
+      </w:pPr>
+      <w:r>
+        <w:rPr>
+          <w:rFonts w:ascii="Arial" w:cs="Arial" w:eastAsia="Arial" w:hAnsi="Arial"/>
+          <w:b w:val="false"/>
+          <w:bCs w:val="false"/>
+          <w:sz w:val="22"/>
+          <w:szCs w:val="22"/>
+        </w:rPr>
+        <w:t xml:space="preserve">Enemy Disposal: dead enemies that cannot be contained (no free Holding Cell at Containment Block) go here instead.</w:t>
       </w:r>
     </w:p>
     <w:p>

</xml_diff>

<commit_message>
Fix Boss/Unit/Gear/Enemy card-breakdown field names to match CSV columns
Rules.docx called Unit fields "Primary Ability"/"Secondary Ability" and
the Health field on Units/Gear/Enemies "Health", but the actual CSV
columns are Main Effect/Bonus Effects and HP. Renamed in both rule docs
to match the data exactly.

Co-Authored-By: Claude Sonnet 4.6 <noreply@anthropic.com>
</commit_message>
<xml_diff>
--- a/Board_Rules_Reorganized.docx
+++ b/Board_Rules_Reorganized.docx
@@ -4200,7 +4200,7 @@
           <w:sz w:val="22"/>
           <w:szCs w:val="22"/>
         </w:rPr>
-        <w:t xml:space="preserve">Primary / Secondary Ability — the unit’s combat effects.</w:t>
+        <w:t xml:space="preserve">Main Effect / Bonus Effects — the unit’s combat effects.</w:t>
       </w:r>
     </w:p>
     <w:p>
@@ -4240,7 +4240,7 @@
           <w:sz w:val="22"/>
           <w:szCs w:val="22"/>
         </w:rPr>
-        <w:t xml:space="preserve">Damage / Health — combat stats.</w:t>
+        <w:t xml:space="preserve">Damage / HP — combat stats.</w:t>
       </w:r>
     </w:p>
     <w:p>
@@ -4388,7 +4388,7 @@
           <w:sz w:val="22"/>
           <w:szCs w:val="22"/>
         </w:rPr>
-        <w:t xml:space="preserve">Damage / Health — bonus combat stats granted to the equipped unit.</w:t>
+        <w:t xml:space="preserve">Damage / HP — bonus combat stats granted to the equipped unit.</w:t>
       </w:r>
     </w:p>
     <w:p>
@@ -4536,7 +4536,7 @@
           <w:sz w:val="22"/>
           <w:szCs w:val="22"/>
         </w:rPr>
-        <w:t xml:space="preserve">Damage / Health — combat stats.</w:t>
+        <w:t xml:space="preserve">Damage / HP — combat stats.</w:t>
       </w:r>
     </w:p>
     <w:p>

</xml_diff>

<commit_message>
Give Units/Enemies/Gear per-card stat variation, rework Gear equip/activation costs
Replaces the previously flat Rank-fixed Damage/HP/Cost curve with a 5-archetype
model (Tank/Glass Cannon/Mobile/Support/Neutral) classified from each card's own
name and ability text, with Armor/Shields given a real Rank-scaled baseline for
the first time (most cards had 0/0 before). Extends the same lean to Scout Value
and to Gear's existing stats, and fixes a parallel Gear Shields gap (Shield
Generator/Projector/Deployable Shield weren't reflecting their own shield text
in the Shields column).

Also reworks Gear's equip/activation cost model: equipping is now always free,
and the cost moves to activating an equipped item's Active effect instead
(Passives stay free, Consumables are exempt). Updates the 4 Event Cards that
referenced the old equip-cost wording to match.

Co-Authored-By: Claude Sonnet 4.6 <noreply@anthropic.com>
</commit_message>
<xml_diff>
--- a/Board_Rules_Reorganized.docx
+++ b/Board_Rules_Reorganized.docx
@@ -2767,7 +2767,7 @@
           <w:sz w:val="22"/>
           <w:szCs w:val="22"/>
         </w:rPr>
-        <w:t xml:space="preserve">equipped abilities usable once per round; gear can be equipped any time by paying its cost again.</w:t>
+        <w:t xml:space="preserve">equipping gear onto a unit (or moving it to a different unit) is free, any time, as long as you already own it. Activating an equipped item’s Active effect costs its Purchase Cost again, paid each time used, still limited to once per round — Passive effects are always active and never cost anything. Consumables are exempt: pay their Purchase Cost once at purchase, no separate activation cost.</w:t>
       </w:r>
     </w:p>
     <w:p>
@@ -2823,7 +2823,7 @@
           <w:sz w:val="22"/>
           <w:szCs w:val="22"/>
         </w:rPr>
-        <w:t xml:space="preserve">between fights, retire a living unit back to the shop deck for a partial refund (1 of its 3 resource costs); its equipped gear can be re-equipped for free this round.</w:t>
+        <w:t xml:space="preserve">between fights, retire a living unit back to the shop deck for a partial refund (1 of its 3 resource costs); its equipped gear returns to your hand and can be re-equipped elsewhere (equipping is always free).</w:t>
       </w:r>
     </w:p>
     <w:p>

</xml_diff>

<commit_message>
Fix redesign ripple effects and define 3 more rule gaps
Checking every card for "progress"/"overrun" references after the win/loss
redesign found real breakage: Trojan/Stubborn/Incompetence (Secret
Objectives) hinged on Player Progress decreasing, which can no longer
happen, making them unsatisfiable or trivially true -- redirected to the
Overrun Tracker instead. Forward Command and Deus Machina referenced the
old loss mechanism by name and needed the same redirect.

Also resolved 3 longstanding gaps: Scout Value's mechanical meaning was
never defined (now passive income to the Command pool, with enemy-reveal
count as its own separate flat rule); default combat turn order was unstated
(enemy acts first unless an ability grants the player's unit priority); and
the empty-scout-pool edge case is now explicit.

Co-Authored-By: Claude Sonnet 4.6 <noreply@anthropic.com>
</commit_message>
<xml_diff>
--- a/Board_Rules_Reorganized.docx
+++ b/Board_Rules_Reorganized.docx
@@ -2031,7 +2031,7 @@
           <w:sz w:val="22"/>
           <w:szCs w:val="22"/>
         </w:rPr>
-        <w:t xml:space="preserve">The commander selects a scout from the scout pile to be active this round. If the scout dies, the commander assigns a replacement.</w:t>
+        <w:t xml:space="preserve">The commander selects a scout from the scout pile to be active this round. If the scout dies, the commander assigns a replacement. If the scout pile is empty (no Scout-type unit donated yet), skip this step entirely this round.</w:t>
       </w:r>
     </w:p>
     <w:tbl>
@@ -2081,7 +2081,7 @@
                 <w:sz w:val="22"/>
                 <w:szCs w:val="22"/>
               </w:rPr>
-              <w:t xml:space="preserve">Scouts are the main counterplay to enemy Reveal effects: scouted enemies are turned face-up before being dealt into lanes, and a card already face-up from scouting does NOT trigger its Reveal effect when it enters play. A higher Scout Value lets the commander flip more incoming enemies before they hit the board.</w:t>
+              <w:t xml:space="preserve">Scouts are the main counterplay to enemy Reveal effects: scouted enemies are turned face-up before being dealt into lanes, and a card already face-up from scouting does NOT trigger its Reveal effect when it enters play. By default, scouting reveals 1 enemy each round; some units’ own ability text grants more (e.g. “Scouts +1 enemy,” “Reveals 2x units when scouting”). Separately, the active scout’s Scout Value (Organic/Tech/Alien) is added to the Command pool the moment it is assigned as that round’s scout — a passive trickle of income for fielding a scout, distinct from how many enemies get revealed.</w:t>
             </w:r>
           </w:p>
         </w:tc>
@@ -2300,7 +2300,7 @@
           <w:sz w:val="22"/>
           <w:szCs w:val="22"/>
         </w:rPr>
-        <w:t xml:space="preserve">The commander picks which lane goes first. Starting there, units trade damage (and trigger abilities) until one side dies; any leftover damage stays on a surviving unit until it fights again. When a unit dies, move it to the appropriate pile and move to the next lane. Repeat until every lane has either killed all its enemies or been overrun.</w:t>
+        <w:t xml:space="preserve">The commander picks which lane goes first. By default the enemy's Active card deals damage first each exchange, then the player's Active unit responds – unless an ability grants the player's unit priority (e.g. "Attacks 1st"), in which case that unit goes first instead. Units trade damage (and trigger abilities) until one side dies; any leftover damage stays on a surviving unit until it fights again. When a unit dies, move it to the appropriate pile and move to the next lane. Repeat until every lane has either killed all its enemies or been overrun.</w:t>
       </w:r>
     </w:p>
     <w:p>
@@ -4243,7 +4243,7 @@
           <w:sz w:val="22"/>
           <w:szCs w:val="22"/>
         </w:rPr>
-        <w:t xml:space="preserve">Scout Value — value when used as a scout.</w:t>
+        <w:t xml:space="preserve">Scout Value — resources (Organic/Tech/Alien) generated each round this unit is the active scout, added to the Command pool (see 3.2 Assign Scouts).</w:t>
       </w:r>
     </w:p>
     <w:p>

</xml_diff>

<commit_message>
Fix more redesign ripple effects: Quick Start text, 2 enemies, component note
A thorough sweep for "progress"/"overrun" references missed by the last
pass found: Board_Rules_Reorganized.docx's own Quick Start section still
described the old dual-track race ("racing to fill the player Progress
Track before the enemy Progress Track fills first"); the Easy-difficulty
note in both docs still said unassigned lanes don't "contribute to overruns
or progress" with no Overrun Tracker mention; Tunnler and Tactician (both
enemies) had abilities that directly reduced Player Progress, which is no
longer possible; and Location Actions.csv's Progress Track description
still said progress is "lost through damage to base" with no distinction
from the new Overrun Tracker.

Co-Authored-By: Claude Sonnet 4.6 <noreply@anthropic.com>
</commit_message>
<xml_diff>
--- a/Board_Rules_Reorganized.docx
+++ b/Board_Rules_Reorganized.docx
@@ -620,7 +620,7 @@
           <w:sz w:val="22"/>
           <w:szCs w:val="22"/>
         </w:rPr>
-        <w:t xml:space="preserve">Board is a cooperative game: all players work together to defend 4 lanes against waves of enemies, racing to fill the player Progress Track before the enemy Progress Track fills first.</w:t>
+        <w:t xml:space="preserve">Board is a cooperative game: all players work together to defend 4 lanes against waves of enemies, racing to fill the player Progress Track to 10 before the Overrun Tracker (a separate dial tracking how much overrun damage the team can absorb) runs out.</w:t>
       </w:r>
     </w:p>
     <w:p>
@@ -688,7 +688,7 @@
           <w:sz w:val="22"/>
           <w:szCs w:val="22"/>
         </w:rPr>
-        <w:t xml:space="preserve">You win by filling your Progress Track to 10 before the enemy track fills to 10.</w:t>
+        <w:t xml:space="preserve">You win by filling your Progress Track to 10. You lose if the Overrun Tracker reaches 0 (overruns damage it; the enemy Progress Track is a separate danger dial, not the loss condition).</w:t>
       </w:r>
     </w:p>
     <w:p>
@@ -1065,7 +1065,7 @@
           <w:sz w:val="22"/>
           <w:szCs w:val="22"/>
         </w:rPr>
-        <w:t xml:space="preserve">extra lanes aren’t used at all — no enemies dealt, no contribution to overruns or progress.</w:t>
+        <w:t xml:space="preserve">extra lanes aren’t used at all — no enemies dealt, no Overrun Tracker damage from them, and they’re excluded from the "all lanes survived" check that grants Player Progress.</w:t>
       </w:r>
     </w:p>
     <w:p>

</xml_diff>

<commit_message>
Add multiple Worker Tokens per player and location income floor text
Players now get 2 Worker Tokens (3 at Captain/Rank 4+), plus the
commander gets +1 for the round; Worker Token component count updated
10->13 in both rule docs. Medical Bay/Containment Block income floor
text clarified to guarantee a minimum per worker regardless of
injured-slot/contained-enemy count.

Co-Authored-By: Claude Sonnet 4.6 <noreply@anthropic.com>
</commit_message>
<xml_diff>
--- a/Board_Rules_Reorganized.docx
+++ b/Board_Rules_Reorganized.docx
@@ -1564,7 +1564,7 @@
           <w:sz w:val="22"/>
           <w:szCs w:val="22"/>
         </w:rPr>
-        <w:t xml:space="preserve">Players place their Worker Token at a location, in turn order starting from the player next to the commander. Most locations generate income; a few have special effects (see Section 4, Locations, for what each one does).</w:t>
+        <w:t xml:space="preserve">Each player has 2 Worker Tokens, rising to 3 once they reach Rank 4 (Captain) or higher; whoever is commander this round gets one additional worker for the round. Players place all their Worker Tokens at locations (one at a time, in turn order starting from the player next to the commander, going around the table as many times as needed) – the same player can place multiple workers across different locations, or stack them at the same one. Most locations generate income; a few have special effects (see Section 4, Locations, for what each one does).</w:t>
       </w:r>
     </w:p>
     <w:tbl>
@@ -2300,7 +2300,7 @@
           <w:sz w:val="22"/>
           <w:szCs w:val="22"/>
         </w:rPr>
-        <w:t xml:space="preserve">The commander picks which lane goes first. By default the enemy's Active card deals damage first each exchange, then the player's Active unit responds – unless an ability grants the player's unit priority (e.g. "Attacks 1st"), in which case that unit goes first instead. Units trade damage (and trigger abilities) until one side dies; any leftover damage stays on a surviving unit until it fights again. When a unit dies, move it to the appropriate pile and move to the next lane. Repeat until every lane has either killed all its enemies or been overrun.</w:t>
+        <w:t xml:space="preserve">The commander picks which lane goes first. By default each exchange is simultaneous: the player’s Active unit and the enemy’s Active card deal damage to each other at the same time, both applying before either side checks for death. Unless an ability grants a unit priority (e.g. “Attacks 1st”), in which case that unit deals its damage FIRST, resolved completely (including killing its target outright) before the other side ever gets to act. Units trade damage (and trigger abilities) until one side dies; any leftover damage stays on a surviving unit until it fights again. When a unit dies, move it to the appropriate pile and move to the next lane. Repeat until every lane has either killed all its enemies or been overrun.</w:t>
       </w:r>
     </w:p>
     <w:p>
@@ -3484,7 +3484,7 @@
           <w:sz w:val="22"/>
           <w:szCs w:val="22"/>
         </w:rPr>
-        <w:t xml:space="preserve">Worker Placement: each worker fully heals 1 unit, and grants 2 Organic for each injured unit healed.</w:t>
+        <w:t xml:space="preserve">Worker Placement: each worker fully heals 1 unit, and grants 2 Organic for each injured unit healed, plus 1 Organic per worker regardless.</w:t>
       </w:r>
     </w:p>
     <w:p>
@@ -3532,7 +3532,7 @@
           <w:sz w:val="22"/>
           <w:szCs w:val="22"/>
         </w:rPr>
-        <w:t xml:space="preserve">Worker Placement: gain Alien equal to the combined Rank of contained units; consumed units are removed from play entirely (not returned to the enemy deck).</w:t>
+        <w:t xml:space="preserve">Worker Placement: gain Alien equal to the combined Rank of contained units, plus 1 Alien per worker regardless; consumed units are removed from play entirely (not returned to the enemy deck).</w:t>
       </w:r>
     </w:p>
     <w:p>
@@ -5971,7 +5971,7 @@
                 <w:sz w:val="20"/>
                 <w:szCs w:val="20"/>
               </w:rPr>
-              <w:t xml:space="preserve">10</w:t>
+              <w:t xml:space="preserve">13</w:t>
             </w:r>
           </w:p>
         </w:tc>

</xml_diff>

<commit_message>
Add full-coverage game simulator and rules-review fixes
Working/sim.py implements every card's actual effect across all 8 decks
(Command, Gear, Unit, Enemy, Boss, Mission, Event, Secret Objective,
Tactician) instead of a simplified balance approximation, plus a sample
test-game round log and findings. Also folds in the rules-review fixes
found while building it: Command Cards are a personal-hand mechanic
(not a shared per-location pool), commander selection is a race to
Command rather than a fixed rotation, the stale Overrun Tracker Key
Term and Component Count table are corrected, and Command Card costs
are halved to match actual command-pool income levels.

Co-Authored-By: Claude Sonnet 4.6 <noreply@anthropic.com>
</commit_message>
<xml_diff>
--- a/Board_Rules_Reorganized.docx
+++ b/Board_Rules_Reorganized.docx
@@ -2874,7 +2874,7 @@
           <w:sz w:val="22"/>
           <w:szCs w:val="22"/>
         </w:rPr>
-        <w:t xml:space="preserve">activatable any time you have a worker at Command. Only the current commander can use a card’s Upgrade function; the commander plays the Instant portion of any card for free.</w:t>
+        <w:t xml:space="preserve">activatable any time you have a worker at Command or Battlefield. Only the current commander can use a card’s Upgrade function; the commander plays the Instant portion of any card for free.</w:t>
       </w:r>
     </w:p>
     <w:p>
@@ -4158,7 +4158,7 @@
           <w:sz w:val="22"/>
           <w:szCs w:val="22"/>
         </w:rPr>
-        <w:t xml:space="preserve">Instant — a free effect usable without paying the cost.</w:t>
+        <w:t xml:space="preserve">Instant — an effect usable without building it as an Upgrade. The commander may play it for free; any other player may also play it by paying its cost, if eligible (worker at Command or Battlefield).</w:t>
       </w:r>
     </w:p>
     <w:p>
@@ -5027,7 +5027,7 @@
                 <w:sz w:val="20"/>
                 <w:szCs w:val="20"/>
               </w:rPr>
-              <w:t xml:space="preserve">60</w:t>
+              <w:t xml:space="preserve">61</w:t>
             </w:r>
           </w:p>
         </w:tc>
@@ -5279,7 +5279,7 @@
                 <w:sz w:val="20"/>
                 <w:szCs w:val="20"/>
               </w:rPr>
-              <w:t xml:space="preserve">102</w:t>
+              <w:t xml:space="preserve">103</w:t>
             </w:r>
           </w:p>
         </w:tc>
@@ -5531,7 +5531,7 @@
                 <w:sz w:val="20"/>
                 <w:szCs w:val="20"/>
               </w:rPr>
-              <w:t xml:space="preserve">66</w:t>
+              <w:t xml:space="preserve">68</w:t>
             </w:r>
           </w:p>
         </w:tc>
@@ -6282,7 +6282,7 @@
           <w:sz w:val="22"/>
           <w:szCs w:val="22"/>
         </w:rPr>
-        <w:t xml:space="preserve">what happens to a lane when enemies survive combat there with no player unit left to defend it. Costs the player Progress Track 1 progress (see 3.4 Overrunning Lanes).</w:t>
+        <w:t xml:space="preserve">what happens to a lane when enemies survive combat there with no player unit left to defend it. Costs the Overrun Tracker 1 (see 3.4 Overrunning Lanes); the player Progress Track is not affected by overruns directly.</w:t>
       </w:r>
     </w:p>
     <w:p>
@@ -8083,7 +8083,7 @@
           <w:sz w:val="22"/>
           <w:szCs w:val="22"/>
         </w:rPr>
-        <w:t xml:space="preserve">Armor and Shields are now their own fields on Units, Gear, and Enemies (matching how Damage/HP already worked), instead of being buried as prose inside ability text — 25 units, 9 gear items, and 9 enemies had their flat base-stat text extracted into the new fields; anything conditional, granted-to-others, or formula-based was deliberately left as prose rather than force-fit into a flat number.</w:t>
+        <w:t xml:space="preserve">Armor and Shields are now their own fields on Units, Gear, and Enemies (matching how Damage/HP already worked), instead of being buried as prose inside ability text — 25 units, 9 gear items, and 9 enemies had their flat base-stat text extracted into the new fields at the time of this edit (that count has grown substantially since, after the archetype-based stat-variation system was added later in playtesting); anything conditional, granted-to-others, or formula-based was deliberately left as prose rather than force-fit into a flat number.</w:t>
       </w:r>
     </w:p>
     <w:p>

</xml_diff>

<commit_message>
Add 17-change rules revision from 3-game playtest review
Implements every confirmed fix from reviewing the 3 manual playtest games:
Round 0 prep round, Fodder enemies stripped of ability text, post-combat
Lane Reinforcement, same-round Reserve promotion, gear-survives-death,
worker-free Command Donations, Rank-separated Unit/Gear decks with
never-exhaustible cards, Tech-cost gear equipping, raised Command Card
hand size, plus a batch of combat/cleanup edge-case clarifications. Two
items (starting Organic, Mission Rank-scaling promotions) are flagged as
designer recommendations pending the next playtest. See README Feedback
#31-40 and the Playtest Log's new Resolution section for full reasoning.
</commit_message>
<xml_diff>
--- a/Board_Rules_Reorganized.docx
+++ b/Board_Rules_Reorganized.docx
@@ -340,6 +340,24 @@
           <w:sz w:val="22"/>
           <w:szCs w:val="22"/>
         </w:rPr>
+        <w:t xml:space="preserve">Round 0 (prep round, before Round 1)</w:t>
+      </w:r>
+    </w:p>
+    <w:p>
+      <w:pPr>
+        <w:pStyle w:val="ListParagraph"/>
+        <w:numPr>
+          <w:ilvl w:val="1"/>
+          <w:numId w:val="2"/>
+        </w:numPr>
+        <w:spacing w:after="80"/>
+      </w:pPr>
+      <w:r>
+        <w:rPr>
+          <w:rFonts w:ascii="Arial" w:cs="Arial" w:eastAsia="Arial" w:hAnsi="Arial"/>
+          <w:sz w:val="22"/>
+          <w:szCs w:val="22"/>
+        </w:rPr>
         <w:t xml:space="preserve">3.1 Planning Stage</w:t>
       </w:r>
     </w:p>
@@ -394,7 +412,43 @@
           <w:sz w:val="22"/>
           <w:szCs w:val="22"/>
         </w:rPr>
+        <w:t xml:space="preserve">Lane Reinforcement</w:t>
+      </w:r>
+    </w:p>
+    <w:p>
+      <w:pPr>
+        <w:pStyle w:val="ListParagraph"/>
+        <w:numPr>
+          <w:ilvl w:val="1"/>
+          <w:numId w:val="2"/>
+        </w:numPr>
+        <w:spacing w:after="80"/>
+      </w:pPr>
+      <w:r>
+        <w:rPr>
+          <w:rFonts w:ascii="Arial" w:cs="Arial" w:eastAsia="Arial" w:hAnsi="Arial"/>
+          <w:sz w:val="22"/>
+          <w:szCs w:val="22"/>
+        </w:rPr>
         <w:t xml:space="preserve">3.4 Cleanup Stage</w:t>
+      </w:r>
+    </w:p>
+    <w:p>
+      <w:pPr>
+        <w:pStyle w:val="ListParagraph"/>
+        <w:numPr>
+          <w:ilvl w:val="1"/>
+          <w:numId w:val="2"/>
+        </w:numPr>
+        <w:spacing w:after="80"/>
+      </w:pPr>
+      <w:r>
+        <w:rPr>
+          <w:rFonts w:ascii="Arial" w:cs="Arial" w:eastAsia="Arial" w:hAnsi="Arial"/>
+          <w:sz w:val="22"/>
+          <w:szCs w:val="22"/>
+        </w:rPr>
+        <w:t xml:space="preserve">Command Card Refill</w:t>
       </w:r>
     </w:p>
     <w:p>
@@ -862,35 +916,27 @@
           <w:sz w:val="22"/>
           <w:szCs w:val="22"/>
         </w:rPr>
-        <w:t xml:space="preserve">Unit Deck: remove Vehicles and Mechs, set aside (unlocked later via Barracks expansions).</w:t>
-      </w:r>
-    </w:p>
-    <w:p>
-      <w:pPr>
-        <w:pStyle w:val="ListParagraph"/>
-        <w:numPr>
-          <w:ilvl w:val="0"/>
-          <w:numId w:val="2"/>
-        </w:numPr>
-        <w:spacing w:after="80"/>
-      </w:pPr>
-      <w:r>
-        <w:rPr>
-          <w:rFonts w:ascii="Arial" w:cs="Arial" w:eastAsia="Arial" w:hAnsi="Arial"/>
-          <w:b w:val="false"/>
-          <w:bCs w:val="false"/>
-          <w:sz w:val="22"/>
-          <w:szCs w:val="22"/>
-        </w:rPr>
-        <w:t xml:space="preserve">Gear Deck: remove Experimental gear, set aside (unlocked later via the Armory expansion).</w:t>
-      </w:r>
-    </w:p>
-    <w:p>
-      <w:pPr>
-        <w:pStyle w:val="Heading2"/>
-      </w:pPr>
-      <w:r>
-        <w:t xml:space="preserve">2.2 Deal starting cards</w:t>
+        <w:t xml:space="preserve">Unit Deck: remove Vehicles and Mechs, set aside (unlocked later via Barracks expansions), then separate the remaining Unit deck into piles by Rank (same as the Enemy Deck).</w:t>
+      </w:r>
+    </w:p>
+    <w:p>
+      <w:pPr>
+        <w:pStyle w:val="ListParagraph"/>
+        <w:numPr>
+          <w:ilvl w:val="0"/>
+          <w:numId w:val="2"/>
+        </w:numPr>
+        <w:spacing w:after="80"/>
+      </w:pPr>
+      <w:r>
+        <w:rPr>
+          <w:rFonts w:ascii="Arial" w:cs="Arial" w:eastAsia="Arial" w:hAnsi="Arial"/>
+          <w:b w:val="false"/>
+          <w:bCs w:val="false"/>
+          <w:sz w:val="22"/>
+          <w:szCs w:val="22"/>
+        </w:rPr>
+        <w:t xml:space="preserve">Gear Deck: remove Experimental gear, set aside (unlocked later via the Armory expansion), then separate the remaining Gear deck into piles by Rank (same as the Enemy Deck).</w:t>
       </w:r>
     </w:p>
     <w:p>
@@ -907,6 +953,31 @@
           <w:sz w:val="22"/>
           <w:szCs w:val="22"/>
         </w:rPr>
+        <w:t xml:space="preserve">Decks should never be treated as exhaustible: any card drawn, examined, or passed over without being kept by anyone — including unsold shop cards at Cleanup (see Clearing the shop, 3.1) and over-Rank cards a commander skips past while searching for a valid Direct fill pick — returns to the bottom of its respective deck/pile rather than being removed from the game.</w:t>
+      </w:r>
+    </w:p>
+    <w:p>
+      <w:pPr>
+        <w:pStyle w:val="Heading2"/>
+      </w:pPr>
+      <w:r>
+        <w:t xml:space="preserve">2.2 Deal starting cards</w:t>
+      </w:r>
+    </w:p>
+    <w:p>
+      <w:pPr>
+        <w:spacing w:after="160"/>
+      </w:pPr>
+      <w:r>
+        <w:rPr>
+          <w:rFonts w:ascii="Arial" w:cs="Arial" w:eastAsia="Arial" w:hAnsi="Arial"/>
+          <w:b w:val="false"/>
+          <w:bCs w:val="false"/>
+          <w:i w:val="false"/>
+          <w:iCs w:val="false"/>
+          <w:sz w:val="22"/>
+          <w:szCs w:val="22"/>
+        </w:rPr>
         <w:t xml:space="preserve">Each player starts with:</w:t>
       </w:r>
     </w:p>
@@ -988,6 +1059,26 @@
           <w:szCs w:val="22"/>
         </w:rPr>
         <w:t xml:space="preserve">2× Command Cards</w:t>
+      </w:r>
+    </w:p>
+    <w:p>
+      <w:pPr>
+        <w:pStyle w:val="ListParagraph"/>
+        <w:numPr>
+          <w:ilvl w:val="0"/>
+          <w:numId w:val="2"/>
+        </w:numPr>
+        <w:spacing w:after="80"/>
+      </w:pPr>
+      <w:r>
+        <w:rPr>
+          <w:rFonts w:ascii="Arial" w:cs="Arial" w:eastAsia="Arial" w:hAnsi="Arial"/>
+          <w:b w:val="false"/>
+          <w:bCs w:val="false"/>
+          <w:sz w:val="22"/>
+          <w:szCs w:val="22"/>
+        </w:rPr>
+        <w:t xml:space="preserve">2 Organic (added as a designer recommendation following the 2026-06-25 playtest review — flag for confirmation after the next playtest, not yet battle-tested)</w:t>
       </w:r>
     </w:p>
     <w:p>
@@ -1192,7 +1283,7 @@
           <w:sz w:val="22"/>
           <w:szCs w:val="22"/>
         </w:rPr>
-        <w:t xml:space="preserve">Players vote on a starting leader. The leader starts at +1 Rank and +2 Command Cards, and is the game’s first commander.</w:t>
+        <w:t xml:space="preserve">Players vote on a starting leader. The leader starts at +1 Rank and +2 Command Cards. After Leader Selection, the game plays a Round 0 (see Round 0, before 3.1) — a single prep round with full Planning and Deployment Stages but no Combat Stage — before Round 1 begins. The leader does NOT automatically become commander; Round 0's commander is determined by Worker Placement like any other round, and Round 1 in turn holds its commander over from Round 0.</w:t>
       </w:r>
     </w:p>
     <w:p>
@@ -1388,6 +1479,48 @@
         <w:pStyle w:val="Heading2"/>
       </w:pPr>
       <w:r>
+        <w:t xml:space="preserve">Round 0 (prep round, before Round 1)</w:t>
+      </w:r>
+    </w:p>
+    <w:p>
+      <w:pPr>
+        <w:spacing w:after="160"/>
+      </w:pPr>
+      <w:r>
+        <w:rPr>
+          <w:rFonts w:ascii="Arial" w:cs="Arial" w:eastAsia="Arial" w:hAnsi="Arial"/>
+          <w:b w:val="false"/>
+          <w:bCs w:val="false"/>
+          <w:i w:val="false"/>
+          <w:iCs w:val="false"/>
+          <w:sz w:val="22"/>
+          <w:szCs w:val="22"/>
+        </w:rPr>
+        <w:t xml:space="preserve">Before Round 1, the game runs a Round 0: a single prep round with no enemies and no fighting. Round 0 runs a full Planning Stage AND a full Deployment Stage exactly as normal — worker placement, income generation, purchasing, Command Donations, healing, Assign Scouts, Reassign Units, and Manage Equipment all happen on schedule. Round 0 has NO Combat Stage at all: no enemies are drawn or dealt into any lane, and Commander Actions skips its Event-draw step entirely this round (there is no event to have one drawn). Round 0’s Cleanup only handles Managing the Dead (trivially empty, since nothing fought) and the Command Card Refill; it skips Overrunning Lanes (no lane has enemies to overrun), Event Resolution (no event was drawn or active), Promotions (no event resolved to grant one), and Escalate (the Progress Tracks start at their initial values and have nothing to escalate yet). Round 1 begins immediately after Round 0’s Cleanup, playing exactly as written below — including Round 1’s own Escalate grace period (still skipped) and its own first real enemy draw, Event draw, and so on.</w:t>
+      </w:r>
+    </w:p>
+    <w:p>
+      <w:pPr>
+        <w:spacing w:after="160"/>
+      </w:pPr>
+      <w:r>
+        <w:rPr>
+          <w:rFonts w:ascii="Arial" w:cs="Arial" w:eastAsia="Arial" w:hAnsi="Arial"/>
+          <w:b w:val="false"/>
+          <w:bCs w:val="false"/>
+          <w:i w:val="false"/>
+          <w:iCs w:val="false"/>
+          <w:sz w:val="22"/>
+          <w:szCs w:val="22"/>
+        </w:rPr>
+        <w:t xml:space="preserve">Round 0 still needs a commander for its own Commander Actions, the same as any other round. Since Round 0 is now the round with no previous round to hold over from, it does NOT use the Leader-holdover exception (see 7.2 Key Terms, ’Commander’) — that exception has moved to apply to Round 0 instead of Round 1. Round 0’s commander is simply whoever wins the Command race in Round 0’s own Worker Placement, same as any other round. Round 1, in turn, properly holds over its commander from Round 0’s Worker Placement winner, since Round 0 is no longer a special case once it exists.</w:t>
+      </w:r>
+    </w:p>
+    <w:p>
+      <w:pPr>
+        <w:pStyle w:val="Heading2"/>
+      </w:pPr>
+      <w:r>
         <w:t xml:space="preserve">3.1 Planning Stage</w:t>
       </w:r>
     </w:p>
@@ -1436,7 +1569,7 @@
           <w:sz w:val="22"/>
           <w:szCs w:val="22"/>
         </w:rPr>
-        <w:t xml:space="preserve">Any player below 2 Command Cards draws back up to 2 (the commander draws back up to 3).</w:t>
+        <w:t xml:space="preserve">Command Card hand refill does not happen here — see Command Card Refill, 3.4 Cleanup Stage, for when and how hands are topped up.</w:t>
       </w:r>
     </w:p>
     <w:p>
@@ -1477,6 +1610,26 @@
           <w:szCs w:val="22"/>
         </w:rPr>
         <w:t xml:space="preserve">The commander draws 2 Events and chooses 1 to be active this round.</w:t>
+      </w:r>
+    </w:p>
+    <w:p>
+      <w:pPr>
+        <w:pStyle w:val="ListParagraph"/>
+        <w:numPr>
+          <w:ilvl w:val="0"/>
+          <w:numId w:val="2"/>
+        </w:numPr>
+        <w:spacing w:after="80"/>
+      </w:pPr>
+      <w:r>
+        <w:rPr>
+          <w:rFonts w:ascii="Arial" w:cs="Arial" w:eastAsia="Arial" w:hAnsi="Arial"/>
+          <w:b w:val="false"/>
+          <w:bCs w:val="false"/>
+          <w:sz w:val="22"/>
+          <w:szCs w:val="22"/>
+        </w:rPr>
+        <w:t xml:space="preserve">If a drawn Event’s Completion Condition depends on something not currently possible in the game state (e.g. it requires 2 Active Vehicles before any Vehicle Bay unlock exists), discard it and draw a replacement before presenting the 2 choices to the commander.</w:t>
       </w:r>
     </w:p>
     <w:p>
@@ -1860,7 +2013,7 @@
                 <w:sz w:val="22"/>
                 <w:szCs w:val="22"/>
               </w:rPr>
-              <w:t xml:space="preserve">place any card of Rank 1–3 (Conscript/Private/Sergeant) of the commander’s choice. No roll, guaranteed.</w:t>
+              <w:t xml:space="preserve">draw directly from the relevant Rank pile(s) (see 2.1 Prepare the decks) and place any card of Rank 1–3 (Conscript/Private/Sergeant) of the commander’s choice. No roll, guaranteed, and no need to skip past higher-Rank cards since they live in a separate pile entirely.</w:t>
             </w:r>
           </w:p>
           <w:p>
@@ -1931,6 +2084,23 @@
               <w:t xml:space="preserve">during Cleanup, the commander may clear some or all current shop contents to the bottom of the deck, to cycle out stale offerings.</w:t>
             </w:r>
           </w:p>
+          <w:p>
+            <w:pPr>
+              <w:spacing w:after="100"/>
+            </w:pPr>
+            <w:r>
+              <w:rPr>
+                <w:rFonts w:ascii="Arial" w:cs="Arial" w:eastAsia="Arial" w:hAnsi="Arial"/>
+                <w:b w:val="false"/>
+                <w:bCs w:val="false"/>
+                <w:i w:val="false"/>
+                <w:iCs w:val="false"/>
+                <w:sz w:val="22"/>
+                <w:szCs w:val="22"/>
+              </w:rPr>
+              <w:t xml:space="preserve">This is one instance of a general principle (see 2.1 Prepare the decks): ANY card drawn, examined, or passed over without being kept by anyone returns to the bottom of its deck/pile rather than being removed from the game — decks should never be treated as exhaustible.</w:t>
+            </w:r>
+          </w:p>
         </w:tc>
       </w:tr>
     </w:tbl>
@@ -1973,7 +2143,7 @@
           <w:sz w:val="22"/>
           <w:szCs w:val="22"/>
         </w:rPr>
-        <w:t xml:space="preserve">Players with a worker at Command may donate resources to the Command pool, or donate Units to Command for use as Scouts.</w:t>
+        <w:t xml:space="preserve">Any player may donate resources to the Command pool at any time during Planning, regardless of whether they have a worker placed at Command. Players can also donate a Scout-eligible Unit to Command for use as a Scout the same way — no worker placement at Command is required for either kind of donation.</w:t>
       </w:r>
     </w:p>
     <w:p>
@@ -2031,7 +2201,7 @@
           <w:sz w:val="22"/>
           <w:szCs w:val="22"/>
         </w:rPr>
-        <w:t xml:space="preserve">The commander selects a scout from the scout pile to be active this round. If the scout dies, the commander assigns a replacement. If the scout pile is empty (no Scout-type unit donated yet), skip this step entirely this round.</w:t>
+        <w:t xml:space="preserve">The commander selects a scout from the scout pile to be active this round. If the scout dies, the commander assigns a replacement. If the scout pile is empty (no Scout-type unit donated yet), the commander still gets the normal baseline scouting effect — choosing 1 enemy card to reveal/scout this round — just with no Scout Value income added to the Command pool, since there is no scout unit generating it.</w:t>
       </w:r>
     </w:p>
     <w:tbl>
@@ -2222,27 +2392,87 @@
           <w:sz w:val="22"/>
           <w:szCs w:val="22"/>
         </w:rPr>
-        <w:t xml:space="preserve">Draw enemy cards into each lane’s reserve: count per lane comes from Difficulty and current Player Progress (see 2.4 Enemy hoard size per lane); Rank drawn comes from current Enemy Progress (Fodder 0-1, Grunt 2-3, Core 4-5, Advanced 6-7, Elite 8, General 9, Conqueror 10).</w:t>
-      </w:r>
-    </w:p>
-    <w:p>
-      <w:pPr>
-        <w:pStyle w:val="ListParagraph"/>
-        <w:numPr>
-          <w:ilvl w:val="0"/>
-          <w:numId w:val="2"/>
-        </w:numPr>
-        <w:spacing w:after="80"/>
-      </w:pPr>
-      <w:r>
-        <w:rPr>
-          <w:rFonts w:ascii="Arial" w:cs="Arial" w:eastAsia="Arial" w:hAnsi="Arial"/>
-          <w:b w:val="false"/>
-          <w:bCs w:val="false"/>
-          <w:sz w:val="22"/>
-          <w:szCs w:val="22"/>
-        </w:rPr>
-        <w:t xml:space="preserve">Separate out a random selection of enemies per any active scout effects, turn them face up, shuffle back together, then deal into lanes.</w:t>
+        <w:t xml:space="preserve">Draw enemy cards in this exact order:</w:t>
+      </w:r>
+    </w:p>
+    <w:p>
+      <w:pPr>
+        <w:pStyle w:val="ListParagraph"/>
+        <w:numPr>
+          <w:ilvl w:val="0"/>
+          <w:numId w:val="2"/>
+        </w:numPr>
+        <w:spacing w:after="80"/>
+      </w:pPr>
+      <w:r>
+        <w:rPr>
+          <w:rFonts w:ascii="Arial" w:cs="Arial" w:eastAsia="Arial" w:hAnsi="Arial"/>
+          <w:b w:val="false"/>
+          <w:bCs w:val="false"/>
+          <w:sz w:val="22"/>
+          <w:szCs w:val="22"/>
+        </w:rPr>
+        <w:t xml:space="preserve">(a) Draw the FULL total of enemies needed this round into ONE shared face-down pool first — total = per-lane count (see 2.4 Enemy hoard size per lane) × 4 lanes, at the Rank set by current Enemy Progress (Fodder 0-1, Grunt 2-3, Core 4-5, Advanced 6-7, Elite 8, General 9, Conqueror 10).</w:t>
+      </w:r>
+    </w:p>
+    <w:p>
+      <w:pPr>
+        <w:pStyle w:val="ListParagraph"/>
+        <w:numPr>
+          <w:ilvl w:val="0"/>
+          <w:numId w:val="2"/>
+        </w:numPr>
+        <w:spacing w:after="80"/>
+      </w:pPr>
+      <w:r>
+        <w:rPr>
+          <w:rFonts w:ascii="Arial" w:cs="Arial" w:eastAsia="Arial" w:hAnsi="Arial"/>
+          <w:b w:val="false"/>
+          <w:bCs w:val="false"/>
+          <w:sz w:val="22"/>
+          <w:szCs w:val="22"/>
+        </w:rPr>
+        <w:t xml:space="preserve">(b) Apply scout effects: pull out and flip face up however many cards the active scout’s reveal count allows, drawn from that WHOLE shared pool (not per-lane).</w:t>
+      </w:r>
+    </w:p>
+    <w:p>
+      <w:pPr>
+        <w:pStyle w:val="ListParagraph"/>
+        <w:numPr>
+          <w:ilvl w:val="0"/>
+          <w:numId w:val="2"/>
+        </w:numPr>
+        <w:spacing w:after="80"/>
+      </w:pPr>
+      <w:r>
+        <w:rPr>
+          <w:rFonts w:ascii="Arial" w:cs="Arial" w:eastAsia="Arial" w:hAnsi="Arial"/>
+          <w:b w:val="false"/>
+          <w:bCs w:val="false"/>
+          <w:sz w:val="22"/>
+          <w:szCs w:val="22"/>
+        </w:rPr>
+        <w:t xml:space="preserve">(c) Shuffle the entire pool back together — the face-up (scouted) cards and the remaining face-down cards together.</w:t>
+      </w:r>
+    </w:p>
+    <w:p>
+      <w:pPr>
+        <w:pStyle w:val="ListParagraph"/>
+        <w:numPr>
+          <w:ilvl w:val="0"/>
+          <w:numId w:val="2"/>
+        </w:numPr>
+        <w:spacing w:after="80"/>
+      </w:pPr>
+      <w:r>
+        <w:rPr>
+          <w:rFonts w:ascii="Arial" w:cs="Arial" w:eastAsia="Arial" w:hAnsi="Arial"/>
+          <w:b w:val="false"/>
+          <w:bCs w:val="false"/>
+          <w:sz w:val="22"/>
+          <w:szCs w:val="22"/>
+        </w:rPr>
+        <w:t xml:space="preserve">(d) THEN deal cards out into each lane’s reserve, per the normal per-lane count. This order guarantees scouted (face-up) cards land in a random lane rather than being pre-assigned to a specific lane before the reveal happens.</w:t>
       </w:r>
     </w:p>
     <w:p>
@@ -2280,14 +2510,6 @@
     </w:p>
     <w:p>
       <w:pPr>
-        <w:pStyle w:val="Heading3"/>
-      </w:pPr>
-      <w:r>
-        <w:t xml:space="preserve">Combat Cycle</w:t>
-      </w:r>
-    </w:p>
-    <w:p>
-      <w:pPr>
         <w:spacing w:after="160"/>
       </w:pPr>
       <w:r>
@@ -2300,7 +2522,66 @@
           <w:sz w:val="22"/>
           <w:szCs w:val="22"/>
         </w:rPr>
-        <w:t xml:space="preserve">The commander picks which lane goes first. By default each exchange is simultaneous: the player’s Active unit and the enemy’s Active card deal damage to each other at the same time, both applying before either side checks for death. Unless an ability grants a unit priority (e.g. “Attacks 1st”), in which case that unit deals its damage FIRST, resolved completely (including killing its target outright) before the other side ever gets to act. Units trade damage (and trigger abilities) until one side dies; any leftover damage stays on a surviving unit until it fights again. When a unit dies, move it to the appropriate pile and move to the next lane. Repeat until every lane has either killed all its enemies or been overrun.</w:t>
+        <w:t xml:space="preserve">General rule — targeting priority for enemy lane-movement effects: when an enemy ability moves or repositions an enemy to a different lane (e.g. “swap to the lane with the lowest-damage active unit”), and more than one lane would otherwise qualify as the target, prioritize a lane that still has a surviving player unit over a lane that is already fully wiped (no player unit at all) — do not waste a repositioning effect moving into an already-empty lane when a still-contested lane is available.</w:t>
+      </w:r>
+    </w:p>
+    <w:p>
+      <w:pPr>
+        <w:pStyle w:val="Heading3"/>
+      </w:pPr>
+      <w:r>
+        <w:t xml:space="preserve">Combat Cycle</w:t>
+      </w:r>
+    </w:p>
+    <w:p>
+      <w:pPr>
+        <w:spacing w:after="160"/>
+      </w:pPr>
+      <w:r>
+        <w:rPr>
+          <w:rFonts w:ascii="Arial" w:cs="Arial" w:eastAsia="Arial" w:hAnsi="Arial"/>
+          <w:b w:val="false"/>
+          <w:bCs w:val="false"/>
+          <w:i w:val="false"/>
+          <w:iCs w:val="false"/>
+          <w:sz w:val="22"/>
+          <w:szCs w:val="22"/>
+        </w:rPr>
+        <w:t xml:space="preserve">The commander picks which lane goes first. By default each exchange is simultaneous: the player’s Active unit and the enemy’s Active card deal damage to each other at the same time, both applying before either side checks for death. Unless an ability grants a unit priority (e.g. “Attacks 1st”), in which case that unit deals its damage FIRST, resolved completely (including killing its target outright) before the other side ever gets to act. Units trade damage (and trigger abilities) until one side dies; any leftover damage stays on a surviving unit until it fights again. When a unit dies, move it to the appropriate pile.</w:t>
+      </w:r>
+    </w:p>
+    <w:p>
+      <w:pPr>
+        <w:spacing w:after="160"/>
+      </w:pPr>
+      <w:r>
+        <w:rPr>
+          <w:rFonts w:ascii="Arial" w:cs="Arial" w:eastAsia="Arial" w:hAnsi="Arial"/>
+          <w:b w:val="false"/>
+          <w:bCs w:val="false"/>
+          <w:i w:val="false"/>
+          <w:iCs w:val="false"/>
+          <w:sz w:val="22"/>
+          <w:szCs w:val="22"/>
+        </w:rPr>
+        <w:t xml:space="preserve">When a lane’s Active unit or Active enemy dies mid-round, the next Reserve unit on the same side (if any) immediately becomes Active and combat continues THE SAME ROUND — it is not deferred to next round. A lane only moves on entirely once a side has no more Reserve left to promote: at that point, if the enemy side is empty the lane has cleared, if the player side is empty (with enemies remaining) the lane is overrun, and otherwise resolution moves to the next lane and repeats until all lanes have either cleared or been overrun.</w:t>
+      </w:r>
+    </w:p>
+    <w:p>
+      <w:pPr>
+        <w:spacing w:after="160"/>
+      </w:pPr>
+      <w:r>
+        <w:rPr>
+          <w:rFonts w:ascii="Arial" w:cs="Arial" w:eastAsia="Arial" w:hAnsi="Arial"/>
+          <w:b w:val="false"/>
+          <w:bCs w:val="false"/>
+          <w:i w:val="false"/>
+          <w:iCs w:val="false"/>
+          <w:sz w:val="22"/>
+          <w:szCs w:val="22"/>
+        </w:rPr>
+        <w:t xml:space="preserve">Gear on combat death: when a unit with equipped Gear dies in combat (as opposed to a deliberate Retire from Duty, which already returns all of its gear), the unit’s owner picks exactly 1 of its equipped items to keep — that item returns to hand, the same as a Retire. Any additional equipped items beyond that 1 are lost for good.</w:t>
       </w:r>
     </w:p>
     <w:p>
@@ -2522,18 +2803,10 @@
     </w:p>
     <w:p>
       <w:pPr>
-        <w:pStyle w:val="Heading2"/>
-      </w:pPr>
-      <w:r>
-        <w:t xml:space="preserve">3.4 Cleanup Stage</w:t>
-      </w:r>
-    </w:p>
-    <w:p>
-      <w:pPr>
         <w:pStyle w:val="Heading3"/>
       </w:pPr>
       <w:r>
-        <w:t xml:space="preserve">Managing the Dead</w:t>
+        <w:t xml:space="preserve">Lane Reinforcement</w:t>
       </w:r>
     </w:p>
     <w:p>
@@ -2550,15 +2823,7 @@
           <w:sz w:val="22"/>
           <w:szCs w:val="22"/>
         </w:rPr>
-        <w:t xml:space="preserve">Units and gear lost in combat move to their piles, in the order they were lost.</w:t>
-      </w:r>
-    </w:p>
-    <w:p>
-      <w:pPr>
-        <w:pStyle w:val="Heading3"/>
-      </w:pPr>
-      <w:r>
-        <w:t xml:space="preserve">Overrunning Lanes</w:t>
+        <w:t xml:space="preserve">After ALL 4 lanes have resolved their normal Combat Cycle for the round, any lane that fully cleared its enemies (a cleared lane has 0 enemies remaining) may move some or all of its surviving units into a DIFFERENT lane that still has enemies present. Moved units immediately fight as that lane’s Active unit against its current Active enemy — one additional combat exchange, resolved under the normal Combat Cycle rules (simultaneous damage, priority abilities, etc.). This can rescue a lane from what would otherwise be an overrun, since Lane Reinforcement happens before the Overrunning Lanes check in Cleanup Stage.</w:t>
       </w:r>
     </w:p>
     <w:p>
@@ -2575,7 +2840,15 @@
           <w:sz w:val="22"/>
           <w:szCs w:val="22"/>
         </w:rPr>
-        <w:t xml:space="preserve">If any enemies survived combat in a lane, that lane overruns: the Overrun Tracker loses 1 per overrun lane this round (see 7.2 Key Terms) — reaching 0 loses the game. The player Progress Track is not affected by overruns directly; it only advances on clean rounds (see Escalate, below).</w:t>
+        <w:t xml:space="preserve">This works regardless of which order the original lanes resolved in during the round — a lane that cleared early can still help a lane that loses later, and vice versa (a lane that loses early can still be helped by a lane that clears later). Lane Reinforcement only happens once, after every lane’s original Combat Cycle for the round is fully done.</w:t>
+      </w:r>
+    </w:p>
+    <w:p>
+      <w:pPr>
+        <w:pStyle w:val="Heading2"/>
+      </w:pPr>
+      <w:r>
+        <w:t xml:space="preserve">3.4 Cleanup Stage</w:t>
       </w:r>
     </w:p>
     <w:p>
@@ -2583,7 +2856,7 @@
         <w:pStyle w:val="Heading3"/>
       </w:pPr>
       <w:r>
-        <w:t xml:space="preserve">Event Resolution</w:t>
+        <w:t xml:space="preserve">Managing the Dead</w:t>
       </w:r>
     </w:p>
     <w:p>
@@ -2600,7 +2873,7 @@
           <w:sz w:val="22"/>
           <w:szCs w:val="22"/>
         </w:rPr>
-        <w:t xml:space="preserve">Check the active Event’s completion condition; the commander resolves its reward or failure penalty.</w:t>
+        <w:t xml:space="preserve">Units and gear lost in combat move to their piles, in the order they were lost.</w:t>
       </w:r>
     </w:p>
     <w:p>
@@ -2608,7 +2881,7 @@
         <w:pStyle w:val="Heading3"/>
       </w:pPr>
       <w:r>
-        <w:t xml:space="preserve">Promotions</w:t>
+        <w:t xml:space="preserve">Overrunning Lanes</w:t>
       </w:r>
     </w:p>
     <w:p>
@@ -2625,7 +2898,74 @@
           <w:sz w:val="22"/>
           <w:szCs w:val="22"/>
         </w:rPr>
-        <w:t xml:space="preserve">If the Event passed this round, the commander may promote another player who’s below the commander’s Rank. If multiple players are tied for lowest Rank and the commander has no preference, roll among those tied players: use a d8 if 2 or 4 players are tied, or a d6 if 3 players are tied (splits evenly either way, no rerolls needed). If every other player is already at or above the commander’s Rank, no promotion happens this way this round.</w:t>
+        <w:t xml:space="preserve">If any enemies survived combat in a lane, that lane overruns: the Overrun Tracker loses 1 per overrun lane this round (see 7.2 Key Terms) — reaching 0 loses the game. The player Progress Track is not affected by overruns directly; it only advances on clean rounds (see Escalate, below). A lane with enemies present and ZERO player units (never deployed, not just dead) counts as overrun exactly like a lane whose defender died — there is no exchange to resolve, the enemies simply survive uncontested.</w:t>
+      </w:r>
+    </w:p>
+    <w:p>
+      <w:pPr>
+        <w:spacing w:after="160"/>
+      </w:pPr>
+      <w:r>
+        <w:rPr>
+          <w:rFonts w:ascii="Arial" w:cs="Arial" w:eastAsia="Arial" w:hAnsi="Arial"/>
+          <w:b w:val="false"/>
+          <w:bCs w:val="false"/>
+          <w:i w:val="false"/>
+          <w:iCs w:val="false"/>
+          <w:sz w:val="22"/>
+          <w:szCs w:val="22"/>
+        </w:rPr>
+        <w:t xml:space="preserve">If the Overrun Tracker hits 0 at any point during this check, the game ends IMMEDIATELY as a loss — no remaining Cleanup sub-steps (Event Resolution, Promotions, Escalate) are processed once this happens, even if some of this round’s Cleanup hasn’t run yet.</w:t>
+      </w:r>
+    </w:p>
+    <w:p>
+      <w:pPr>
+        <w:pStyle w:val="Heading3"/>
+      </w:pPr>
+      <w:r>
+        <w:t xml:space="preserve">Event Resolution</w:t>
+      </w:r>
+    </w:p>
+    <w:p>
+      <w:pPr>
+        <w:spacing w:after="160"/>
+      </w:pPr>
+      <w:r>
+        <w:rPr>
+          <w:rFonts w:ascii="Arial" w:cs="Arial" w:eastAsia="Arial" w:hAnsi="Arial"/>
+          <w:b w:val="false"/>
+          <w:bCs w:val="false"/>
+          <w:i w:val="false"/>
+          <w:iCs w:val="false"/>
+          <w:sz w:val="22"/>
+          <w:szCs w:val="22"/>
+        </w:rPr>
+        <w:t xml:space="preserve">Check the active Event’s completion condition; the commander resolves its reward or failure penalty.</w:t>
+      </w:r>
+    </w:p>
+    <w:p>
+      <w:pPr>
+        <w:pStyle w:val="Heading3"/>
+      </w:pPr>
+      <w:r>
+        <w:t xml:space="preserve">Promotions</w:t>
+      </w:r>
+    </w:p>
+    <w:p>
+      <w:pPr>
+        <w:spacing w:after="160"/>
+      </w:pPr>
+      <w:r>
+        <w:rPr>
+          <w:rFonts w:ascii="Arial" w:cs="Arial" w:eastAsia="Arial" w:hAnsi="Arial"/>
+          <w:b w:val="false"/>
+          <w:bCs w:val="false"/>
+          <w:i w:val="false"/>
+          <w:iCs w:val="false"/>
+          <w:sz w:val="22"/>
+          <w:szCs w:val="22"/>
+        </w:rPr>
+        <w:t xml:space="preserve">If the Event passed this round, the commander may promote another player (never themselves) who’s below the commander’s Rank. If multiple players are tied for lowest Rank and the commander has no preference, roll among those tied players: use a d8 if 2 or 4 players are tied, or a d6 if 3 players are tied (splits evenly either way, no rerolls needed). If every other player is already at or above the commander’s Rank, no promotion happens this way this round.</w:t>
       </w:r>
     </w:p>
     <w:p>
@@ -2714,10 +3054,10 @@
     </w:p>
     <w:p>
       <w:pPr>
-        <w:pStyle w:val="Heading2"/>
-      </w:pPr>
-      <w:r>
-        <w:t xml:space="preserve">3.5 Anytime Actions</w:t>
+        <w:pStyle w:val="Heading3"/>
+      </w:pPr>
+      <w:r>
+        <w:t xml:space="preserve">Command Card Refill</w:t>
       </w:r>
     </w:p>
     <w:p>
@@ -2734,6 +3074,31 @@
           <w:sz w:val="22"/>
           <w:szCs w:val="22"/>
         </w:rPr>
+        <w:t xml:space="preserve">At Cleanup, once the round’s commander is already finalized, any player below hand size discards unwanted Command Cards to the bottom of the deck and redraws up to their hand size: 3 cards for a non-commander, 4 cards for that round’s commander.</w:t>
+      </w:r>
+    </w:p>
+    <w:p>
+      <w:pPr>
+        <w:pStyle w:val="Heading2"/>
+      </w:pPr>
+      <w:r>
+        <w:t xml:space="preserve">3.5 Anytime Actions</w:t>
+      </w:r>
+    </w:p>
+    <w:p>
+      <w:pPr>
+        <w:spacing w:after="160"/>
+      </w:pPr>
+      <w:r>
+        <w:rPr>
+          <w:rFonts w:ascii="Arial" w:cs="Arial" w:eastAsia="Arial" w:hAnsi="Arial"/>
+          <w:b w:val="false"/>
+          <w:bCs w:val="false"/>
+          <w:i w:val="false"/>
+          <w:iCs w:val="false"/>
+          <w:sz w:val="22"/>
+          <w:szCs w:val="22"/>
+        </w:rPr>
         <w:t xml:space="preserve">These can happen during any stage, whenever relevant:</w:t>
       </w:r>
     </w:p>
@@ -2767,6 +3132,23 @@
     </w:p>
     <w:p>
       <w:pPr>
+        <w:spacing w:after="240"/>
+      </w:pPr>
+      <w:r>
+        <w:rPr>
+          <w:rFonts w:ascii="Arial" w:cs="Arial" w:eastAsia="Arial" w:hAnsi="Arial"/>
+          <w:b w:val="false"/>
+          <w:bCs w:val="false"/>
+          <w:i w:val="false"/>
+          <w:iCs w:val="false"/>
+          <w:sz w:val="22"/>
+          <w:szCs w:val="22"/>
+        </w:rPr>
+        <w:t xml:space="preserve">Mission Rank scaling promotion reward: a completing player gains an ADDITIONAL +1 Rank (so +2 Rank total) if the mission’s bracketed Rank is at least 3 tiers above the completing player’s current Rank at the moment of completion — rewarding a genuine stretch mission with a bigger jump. Capped at +2 total Rank per mission. (Added as a designer recommendation following the 2026-06-25 playtest review — flag for confirmation after the next playtest, not yet battle-tested.)</w:t>
+      </w:r>
+    </w:p>
+    <w:p>
+      <w:pPr>
         <w:pStyle w:val="ListParagraph"/>
         <w:numPr>
           <w:ilvl w:val="0"/>
@@ -2790,7 +3172,24 @@
           <w:sz w:val="22"/>
           <w:szCs w:val="22"/>
         </w:rPr>
-        <w:t xml:space="preserve">equipping gear onto a unit (or moving it to a different unit) is free, any time, as long as you already own it. Activating an equipped item’s Active effect costs its Purchase Cost again, paid each time used, still limited to once per round — Passive effects are always active and never cost anything. Consumables are exempt: pay their Purchase Cost once at purchase, no separate activation cost.</w:t>
+        <w:t xml:space="preserve">equipping gear onto a unit (or moving it to a different unit) costs Tech equal to the gear’s Rank number (Conscript=1, Private=2, Sergeant=3, Captain=4, Major=5, Colonel=6, Specialist=7, Brigadier=8), paid each time it is equipped — including re-equipping it elsewhere — any time, as long as you already own it. Activating an equipped item’s Active effect costs its Purchase Cost again, paid each time used, still limited to once per round — Passive effects are always active and never cost anything. Consumables are exempt: pay their Purchase Cost once at purchase, no separate activation cost.</w:t>
+      </w:r>
+    </w:p>
+    <w:p>
+      <w:pPr>
+        <w:spacing w:after="160"/>
+      </w:pPr>
+      <w:r>
+        <w:rPr>
+          <w:rFonts w:ascii="Arial" w:cs="Arial" w:eastAsia="Arial" w:hAnsi="Arial"/>
+          <w:b w:val="false"/>
+          <w:bCs w:val="false"/>
+          <w:i w:val="false"/>
+          <w:iCs w:val="false"/>
+          <w:sz w:val="22"/>
+          <w:szCs w:val="22"/>
+        </w:rPr>
+        <w:t xml:space="preserve">Design note: the equip cost above is a deliberate partial reversal of the Gear Equip/Activation cost rework (see Section 8, Playtest Changes), which had made equipping free and moved the cost to Activation instead. The 2026-06-25 playtest review found players sitting on a Tech surplus with no real way to spend it down; charging Tech to equip (on top of Activation’s existing Purchase-Cost-again charge) gives Tech a meaningful ongoing drain again.</w:t>
       </w:r>
     </w:p>
     <w:p>
@@ -2846,7 +3245,7 @@
           <w:sz w:val="22"/>
           <w:szCs w:val="22"/>
         </w:rPr>
-        <w:t xml:space="preserve">between fights, retire a living unit back to the shop deck for a partial refund (1 of its 3 resource costs); its equipped gear returns to your hand and can be re-equipped elsewhere (equipping is always free).</w:t>
+        <w:t xml:space="preserve">between fights, retire a living unit back to the shop deck for a partial refund (1 of its 3 resource costs); its equipped gear returns to your hand and can be re-equipped elsewhere (subject to the normal Tech-equal-to-Rank equip cost, see Gear above).</w:t>
       </w:r>
     </w:p>
     <w:p>
@@ -3680,7 +4079,7 @@
           <w:sz w:val="22"/>
           <w:szCs w:val="22"/>
         </w:rPr>
-        <w:t xml:space="preserve">Donations: players with a worker here may donate resources to the Command stockpile.</w:t>
+        <w:t xml:space="preserve">Donations: any player may donate resources to the Command stockpile, or donate a Scout-eligible Unit for use as a Scout, at any time during Planning — no worker placement at Command is required.</w:t>
       </w:r>
     </w:p>
     <w:p>
@@ -4562,7 +4961,47 @@
           <w:sz w:val="22"/>
           <w:szCs w:val="22"/>
         </w:rPr>
+        <w:t xml:space="preserve">Default targeting rule: unless a Reveal or Passive’s own text says otherwise, a damaging or debuffing enemy effect targets player resources/units, and a buffing enemy effect targets enemies (including itself).</w:t>
+      </w:r>
+    </w:p>
+    <w:p>
+      <w:pPr>
+        <w:pStyle w:val="ListParagraph"/>
+        <w:numPr>
+          <w:ilvl w:val="0"/>
+          <w:numId w:val="2"/>
+        </w:numPr>
+        <w:spacing w:after="80"/>
+      </w:pPr>
+      <w:r>
+        <w:rPr>
+          <w:rFonts w:ascii="Arial" w:cs="Arial" w:eastAsia="Arial" w:hAnsi="Arial"/>
+          <w:b w:val="false"/>
+          <w:bCs w:val="false"/>
+          <w:sz w:val="22"/>
+          <w:szCs w:val="22"/>
+        </w:rPr>
         <w:t xml:space="preserve">Passive — always-on effect.</w:t>
+      </w:r>
+    </w:p>
+    <w:p>
+      <w:pPr>
+        <w:pStyle w:val="ListParagraph"/>
+        <w:numPr>
+          <w:ilvl w:val="0"/>
+          <w:numId w:val="2"/>
+        </w:numPr>
+        <w:spacing w:after="80"/>
+      </w:pPr>
+      <w:r>
+        <w:rPr>
+          <w:rFonts w:ascii="Arial" w:cs="Arial" w:eastAsia="Arial" w:hAnsi="Arial"/>
+          <w:b w:val="false"/>
+          <w:bCs w:val="false"/>
+          <w:sz w:val="22"/>
+          <w:szCs w:val="22"/>
+        </w:rPr>
+        <w:t xml:space="preserve">Note: the Fodder Rank tier (Pests, Ticks) is intentionally ability-free — both Reveal and Passive are left blank by design, so the gentlest introductory tier of enemies stays simple stat-sticks (Damage/HP only) instead of risking swingy stacking or scope ambiguity right at the table’s first taste of combat.</w:t>
       </w:r>
     </w:p>
     <w:p>
@@ -6218,15 +6657,15 @@
           <w:sz w:val="22"/>
           <w:szCs w:val="22"/>
         </w:rPr>
-        <w:t xml:space="preserve">Commander: </w:t>
-      </w:r>
-      <w:r>
-        <w:rPr>
-          <w:rFonts w:ascii="Arial" w:cs="Arial" w:eastAsia="Arial" w:hAnsi="Arial"/>
-          <w:sz w:val="22"/>
-          <w:szCs w:val="22"/>
-        </w:rPr>
-        <w:t xml:space="preserve">the player currently filling the Command role (the 1st worker placed at Command each round takes it). Runs Commander Actions, picks shop fills, resolves ties, and more — see 4.5 Command.</w:t>
+        <w:t xml:space="preserve">At combat start: </w:t>
+      </w:r>
+      <w:r>
+        <w:rPr>
+          <w:rFonts w:ascii="Arial" w:cs="Arial" w:eastAsia="Arial" w:hAnsi="Arial"/>
+          <w:sz w:val="22"/>
+          <w:szCs w:val="22"/>
+        </w:rPr>
+        <w:t xml:space="preserve">(as referenced by Event Failure Penalties and similar effects) means the moment that round’s Combat Stage begins, i.e. when the commander starts resolving the first lane. Since Event Failure Penalties are checked at Cleanup (after that round’s combat has already happened), any penalty referencing “at combat start” necessarily applies to the NEXT round’s combat — never retroactively to the round just played.</w:t>
       </w:r>
     </w:p>
     <w:p>
@@ -6246,15 +6685,15 @@
           <w:sz w:val="22"/>
           <w:szCs w:val="22"/>
         </w:rPr>
-        <w:t xml:space="preserve">Lane: </w:t>
-      </w:r>
-      <w:r>
-        <w:rPr>
-          <w:rFonts w:ascii="Arial" w:cs="Arial" w:eastAsia="Arial" w:hAnsi="Arial"/>
-          <w:sz w:val="22"/>
-          <w:szCs w:val="22"/>
-        </w:rPr>
-        <w:t xml:space="preserve">one of the 4 parallel combat columns, each normally overseen by one player. Each lane has its own Active/Reserve slots for both players and enemies.</w:t>
+        <w:t xml:space="preserve">Commander: </w:t>
+      </w:r>
+      <w:r>
+        <w:rPr>
+          <w:rFonts w:ascii="Arial" w:cs="Arial" w:eastAsia="Arial" w:hAnsi="Arial"/>
+          <w:sz w:val="22"/>
+          <w:szCs w:val="22"/>
+        </w:rPr>
+        <w:t xml:space="preserve">the player currently filling the Command role (the 1st worker placed at Command each round takes it). Runs Commander Actions, picks shop fills, resolves ties, and more — see 4.5 Command.</w:t>
       </w:r>
     </w:p>
     <w:p>
@@ -6274,15 +6713,15 @@
           <w:sz w:val="22"/>
           <w:szCs w:val="22"/>
         </w:rPr>
-        <w:t xml:space="preserve">Overrun: </w:t>
-      </w:r>
-      <w:r>
-        <w:rPr>
-          <w:rFonts w:ascii="Arial" w:cs="Arial" w:eastAsia="Arial" w:hAnsi="Arial"/>
-          <w:sz w:val="22"/>
-          <w:szCs w:val="22"/>
-        </w:rPr>
-        <w:t xml:space="preserve">what happens to a lane when enemies survive combat there with no player unit left to defend it. Costs the Overrun Tracker 1 (see 3.4 Overrunning Lanes); the player Progress Track is not affected by overruns directly.</w:t>
+        <w:t xml:space="preserve">Lane: </w:t>
+      </w:r>
+      <w:r>
+        <w:rPr>
+          <w:rFonts w:ascii="Arial" w:cs="Arial" w:eastAsia="Arial" w:hAnsi="Arial"/>
+          <w:sz w:val="22"/>
+          <w:szCs w:val="22"/>
+        </w:rPr>
+        <w:t xml:space="preserve">one of the 4 parallel combat columns, each normally overseen by one player. Each lane has its own Active/Reserve slots for both players and enemies.</w:t>
       </w:r>
     </w:p>
     <w:p>
@@ -6302,15 +6741,15 @@
           <w:sz w:val="22"/>
           <w:szCs w:val="22"/>
         </w:rPr>
-        <w:t xml:space="preserve">Progress Track: </w:t>
-      </w:r>
-      <w:r>
-        <w:rPr>
-          <w:rFonts w:ascii="Arial" w:cs="Arial" w:eastAsia="Arial" w:hAnsi="Arial"/>
-          <w:sz w:val="22"/>
-          <w:szCs w:val="22"/>
-        </w:rPr>
-        <w:t xml:space="preserve">there are two — the player track (0–10, the win condition) and the enemy track (0–10, a pure danger dial driving enemy Rank and Boss-spawn odds; caps at 10 and stays there, does not end the game by itself). See Section 6 and 3.4 Escalate, and Overrun Tracker below.</w:t>
+        <w:t xml:space="preserve">Overrun: </w:t>
+      </w:r>
+      <w:r>
+        <w:rPr>
+          <w:rFonts w:ascii="Arial" w:cs="Arial" w:eastAsia="Arial" w:hAnsi="Arial"/>
+          <w:sz w:val="22"/>
+          <w:szCs w:val="22"/>
+        </w:rPr>
+        <w:t xml:space="preserve">what happens to a lane when enemies survive combat there with no player unit left to defend it — including a lane that was never assigned a player unit at all, not just one whose defender died. Costs the Overrun Tracker 1 (see 3.4 Overrunning Lanes); the player Progress Track is not affected by overruns directly.</w:t>
       </w:r>
     </w:p>
     <w:p>
@@ -6330,6 +6769,34 @@
           <w:sz w:val="22"/>
           <w:szCs w:val="22"/>
         </w:rPr>
+        <w:t xml:space="preserve">Progress Track: </w:t>
+      </w:r>
+      <w:r>
+        <w:rPr>
+          <w:rFonts w:ascii="Arial" w:cs="Arial" w:eastAsia="Arial" w:hAnsi="Arial"/>
+          <w:sz w:val="22"/>
+          <w:szCs w:val="22"/>
+        </w:rPr>
+        <w:t xml:space="preserve">there are two — the player track (0–10, the win condition) and the enemy track (0–10, a pure danger dial driving enemy Rank and Boss-spawn odds; caps at 10 and stays there, does not end the game by itself). See Section 6 and 3.4 Escalate, and Overrun Tracker below.</w:t>
+      </w:r>
+    </w:p>
+    <w:p>
+      <w:pPr>
+        <w:pStyle w:val="ListParagraph"/>
+        <w:numPr>
+          <w:ilvl w:val="0"/>
+          <w:numId w:val="2"/>
+        </w:numPr>
+        <w:spacing w:after="80"/>
+      </w:pPr>
+      <w:r>
+        <w:rPr>
+          <w:rFonts w:ascii="Arial" w:cs="Arial" w:eastAsia="Arial" w:hAnsi="Arial"/>
+          <w:b/>
+          <w:bCs/>
+          <w:sz w:val="22"/>
+          <w:szCs w:val="22"/>
+        </w:rPr>
         <w:t xml:space="preserve">Overrun Tracker: </w:t>
       </w:r>
       <w:r>
@@ -6338,7 +6805,7 @@
           <w:sz w:val="22"/>
           <w:szCs w:val="22"/>
         </w:rPr>
-        <w:t xml:space="preserve">a single 0–20 track (the two physical Progress Tracker components used end to end) that is the actual loss condition — reaching 0 loses the game. Starting position is set by Difficulty (Easy 15, Normal 10, Hard 5), loses 1 per lane overrun each round, no healing. See 3.4 Overrunning Lanes.</w:t>
+        <w:t xml:space="preserve">a single 0–20 track (the two physical Progress Tracker components used end to end) that is the actual loss condition — reaching 0 loses the game IMMEDIATELY, skipping any remaining Cleanup sub-steps that round. Starting position is set by Difficulty (Easy 15, Normal 10, Hard 5), loses 1 per lane overrun each round, no healing. See 3.4 Overrunning Lanes.</w:t>
       </w:r>
     </w:p>
     <w:p>

</xml_diff>

<commit_message>
Add Rank Trickle: +1 Rank every 2 rounds, fixing the Rank-progression gap
Game 4's playtest found unit quality (gated to a player's own Rank) climbing
far slower than Enemy Progress's guaranteed +1/round, even after the prior
17-change revision fully solved early resource starvation. Adds a Cleanup
Stage rule giving every player a guaranteed +1 Rank every 2 rounds, stacking
with Mission/Promotion gains, mirroring the floor Enemy Progress already has.
Designer addition, not yet battle-tested -- see README Feedback #41.
</commit_message>
<xml_diff>
--- a/Board_Rules_Reorganized.docx
+++ b/Board_Rules_Reorganized.docx
@@ -3050,6 +3050,31 @@
           <w:szCs w:val="20"/>
         </w:rPr>
         <w:t xml:space="preserve">See Section 8.1 for the playtest reasoning and test results behind this rule.</w:t>
+      </w:r>
+    </w:p>
+    <w:p>
+      <w:pPr>
+        <w:pStyle w:val="Heading3"/>
+      </w:pPr>
+      <w:r>
+        <w:t xml:space="preserve">Rank Trickle</w:t>
+      </w:r>
+    </w:p>
+    <w:p>
+      <w:pPr>
+        <w:spacing w:after="160"/>
+      </w:pPr>
+      <w:r>
+        <w:rPr>
+          <w:rFonts w:ascii="Arial" w:cs="Arial" w:eastAsia="Arial" w:hAnsi="Arial"/>
+          <w:b w:val="false"/>
+          <w:bCs w:val="false"/>
+          <w:i w:val="false"/>
+          <w:iCs w:val="false"/>
+          <w:sz w:val="22"/>
+          <w:szCs w:val="22"/>
+        </w:rPr>
+        <w:t xml:space="preserve">Every 2 rounds (at the end of Round 2, Round 4, Round 6, and so on, counting actual numbered rounds, not Round 0), every player automatically gains +1 Rank, capped at Brigadier, on top of anything earned from Missions or Promotions that round. Added after a playtest found Player Rank climbing far more slowly than Enemy Progress's own guaranteed +1/round (after Round 1's grace), since unit deploy-Rank is gated to a player's own Rank -- without a guaranteed floor, a team's units can fall permanently behind enemy stat scaling even with a healthy economy. (Designer addition following the 2026-06-25 single-game playtest -- not yet battle-tested, revisit the 2-round cadence after the next playtest.)</w:t>
       </w:r>
     </w:p>
     <w:p>

</xml_diff>

<commit_message>
Add 3-pronged fix for board-wide enemy Reveal damage
Game 5 confirmed Rank Trickle fixed the Rank-floor problem but the team
still lost at Round 6 via the same mechanism: a single enemy Reveal effect
wiping all 4 lanes at once, regardless of individual unit toughness. Both
playtests fielded only 1 scout the entire game, revealing just 2 of 12
enemies/round -- 10 of 12 went completely unscouted. Three stacked fixes:
default scouting reveal count 1->2, a multi-lane damage cap (full damage
only to the enemy's own lane, half to others), and a new Command Card
(Early Warning Network, Battlefield) giving players an active lever
against it. All designer additions, not yet battle-tested -- see README
Feedback #42.
</commit_message>
<xml_diff>
--- a/Board_Rules_Reorganized.docx
+++ b/Board_Rules_Reorganized.docx
@@ -2251,7 +2251,7 @@
                 <w:sz w:val="22"/>
                 <w:szCs w:val="22"/>
               </w:rPr>
-              <w:t xml:space="preserve">Scouts are the main counterplay to enemy Reveal effects: scouted enemies are turned face-up before being dealt into lanes, and a card already face-up from scouting does NOT trigger its Reveal effect when it enters play. By default, scouting reveals 1 enemy each round; some units’ own ability text grants more (e.g. “Scouts +1 enemy,” “Reveals 2x units when scouting”). Separately, the active scout’s Scout Value (Organic/Tech/Alien) is added to the Command pool the moment it is assigned as that round’s scout — a passive trickle of income for fielding a scout, distinct from how many enemies get revealed.</w:t>
+              <w:t xml:space="preserve">Scouts are the main counterplay to enemy Reveal effects: scouted enemies are turned face-up before being dealt into lanes, and a card already face-up from scouting does NOT trigger its Reveal effect when it enters play. By default, scouting reveals 2 enemies each round (raised from 1 after a playtest found teams almost never investing beyond the bare-minimum scout, leaving most of a round's enemy hoard to spawn unrevealed Reveal effects with no counterplay -- designer addition, not yet battle-tested); some units’ own ability text grants more (e.g. “Scouts +1 enemy,” “Reveals 2x units when scouting”). Separately, the active scout’s Scout Value (Organic/Tech/Alien) is added to the Command pool the moment it is assigned as that round’s scout — a passive trickle of income for fielding a scout, distinct from how many enemies get revealed.</w:t>
             </w:r>
           </w:p>
         </w:tc>
@@ -4986,7 +4986,7 @@
           <w:sz w:val="22"/>
           <w:szCs w:val="22"/>
         </w:rPr>
-        <w:t xml:space="preserve">Default targeting rule: unless a Reveal or Passive’s own text says otherwise, a damaging or debuffing enemy effect targets player resources/units, and a buffing enemy effect targets enemies (including itself).</w:t>
+        <w:t xml:space="preserve">Default targeting rule: unless a Reveal or Passive’s own text says otherwise, a damaging or debuffing enemy effect targets player resources/units, and a buffing enemy effect targets enemies (including itself). Multi-lane damage cap: an enemy Reveal or Passive effect that damages more than one lane at once (e.g. “deal damage to all lanes”) deals its full stated damage only to the enemy’s own lane; every other lane it reaches takes half that damage, rounded down (minimum 1 still gets through, same floor as Armor). Designer addition following a playtest where a single board-wide Reveal instance wiped all 4 lanes at once regardless of individual unit toughness -- not yet battle-tested.</w:t>
       </w:r>
     </w:p>
     <w:p>
@@ -5491,7 +5491,7 @@
                 <w:sz w:val="20"/>
                 <w:szCs w:val="20"/>
               </w:rPr>
-              <w:t xml:space="preserve">61</w:t>
+              <w:t xml:space="preserve">62</w:t>
             </w:r>
           </w:p>
         </w:tc>

</xml_diff>